<commit_message>
feat: alternado lista de exercicio
</commit_message>
<xml_diff>
--- a/lista/lista_r/00.mc_lista_ex_r.docx
+++ b/lista/lista_r/00.mc_lista_ex_r.docx
@@ -741,12 +741,86 @@
     <w:p>
       <w:pPr>
         <w:pStyle w:val="Default"/>
-        <w:rPr>
-          <w:rFonts w:ascii="Roboto" w:hAnsi="Roboto"/>
-          <w:sz w:val="36"/>
-          <w:szCs w:val="36"/>
-        </w:rPr>
-      </w:pPr>
+        <w:numPr>
+          <w:ilvl w:val="0"/>
+          <w:numId w:val="17"/>
+        </w:numPr>
+        <w:rPr>
+          <w:rFonts w:ascii="Roboto" w:hAnsi="Roboto"/>
+          <w:sz w:val="36"/>
+          <w:szCs w:val="36"/>
+        </w:rPr>
+      </w:pPr>
+      <w:r>
+        <w:rPr>
+          <w:rFonts w:ascii="Roboto" w:hAnsi="Roboto"/>
+          <w:sz w:val="36"/>
+          <w:szCs w:val="36"/>
+        </w:rPr>
+        <w:t xml:space="preserve">Suba seu algoritmo para o GitHub com o nome do </w:t>
+      </w:r>
+      <w:proofErr w:type="spellStart"/>
+      <w:r>
+        <w:rPr>
+          <w:rFonts w:ascii="Roboto" w:hAnsi="Roboto"/>
+          <w:sz w:val="36"/>
+          <w:szCs w:val="36"/>
+        </w:rPr>
+        <w:t>repo</w:t>
+      </w:r>
+      <w:proofErr w:type="spellEnd"/>
+      <w:r>
+        <w:rPr>
+          <w:rFonts w:ascii="Roboto" w:hAnsi="Roboto"/>
+          <w:sz w:val="36"/>
+          <w:szCs w:val="36"/>
+        </w:rPr>
+        <w:t xml:space="preserve">: </w:t>
+      </w:r>
+      <w:r>
+        <w:rPr>
+          <w:rFonts w:ascii="Roboto" w:hAnsi="Roboto"/>
+          <w:sz w:val="36"/>
+          <w:szCs w:val="36"/>
+        </w:rPr>
+        <w:t>algoritmo-</w:t>
+      </w:r>
+      <w:proofErr w:type="spellStart"/>
+      <w:r>
+        <w:rPr>
+          <w:rFonts w:ascii="Roboto" w:hAnsi="Roboto"/>
+          <w:sz w:val="36"/>
+          <w:szCs w:val="36"/>
+        </w:rPr>
+        <w:t>if</w:t>
+      </w:r>
+      <w:proofErr w:type="spellEnd"/>
+      <w:r>
+        <w:rPr>
+          <w:rFonts w:ascii="Roboto" w:hAnsi="Roboto"/>
+          <w:sz w:val="36"/>
+          <w:szCs w:val="36"/>
+        </w:rPr>
+        <w:t>-</w:t>
+      </w:r>
+      <w:proofErr w:type="spellStart"/>
+      <w:r>
+        <w:rPr>
+          <w:rFonts w:ascii="Roboto" w:hAnsi="Roboto"/>
+          <w:sz w:val="36"/>
+          <w:szCs w:val="36"/>
+        </w:rPr>
+        <w:t>else</w:t>
+      </w:r>
+      <w:proofErr w:type="spellEnd"/>
+      <w:r>
+        <w:rPr>
+          <w:rFonts w:ascii="Roboto" w:hAnsi="Roboto"/>
+          <w:sz w:val="36"/>
+          <w:szCs w:val="36"/>
+        </w:rPr>
+        <w:t>-banco-master</w:t>
+      </w:r>
     </w:p>
     <w:sectPr>
       <w:headerReference w:type="default" r:id="rId7"/>
@@ -3569,6 +3643,7 @@
   <w:style w:type="character" w:default="1" w:styleId="Fontepargpadro">
     <w:name w:val="Default Paragraph Font"/>
     <w:uiPriority w:val="1"/>
+    <w:semiHidden/>
     <w:unhideWhenUsed/>
   </w:style>
   <w:style w:type="table" w:default="1" w:styleId="Tabelanormal">

</xml_diff>